<commit_message>
Finished first simulation run for reactor design. Conversion is 100%, something might be wrong, idk :shrug:
</commit_message>
<xml_diff>
--- a/TERM PROJECT TMP.docx
+++ b/TERM PROJECT TMP.docx
@@ -451,15 +451,16 @@
           <w:b/>
           <w:bCs/>
         </w:rPr>
-        <w:t>Name:</w:t>
-      </w:r>
+        <w:t>Name</w:t>
+      </w:r>
+      <w:proofErr w:type="gramStart"/>
       <w:r>
         <w:rPr>
           <w:rFonts w:cstheme="majorBidi"/>
           <w:b/>
           <w:bCs/>
         </w:rPr>
-        <w:tab/>
+        <w:t>:</w:t>
       </w:r>
       <w:r>
         <w:rPr>
@@ -475,7 +476,24 @@
           <w:b/>
           <w:bCs/>
         </w:rPr>
-        <w:t>Muhamad Nabil Alhanif</w:t>
+        <w:tab/>
+      </w:r>
+      <w:r>
+        <w:rPr>
+          <w:rFonts w:cstheme="majorBidi"/>
+          <w:b/>
+          <w:bCs/>
+        </w:rPr>
+        <w:t>Muhamad</w:t>
+      </w:r>
+      <w:proofErr w:type="gramEnd"/>
+      <w:r>
+        <w:rPr>
+          <w:rFonts w:cstheme="majorBidi"/>
+          <w:b/>
+          <w:bCs/>
+        </w:rPr>
+        <w:t xml:space="preserve"> Nabil Alhanif</w:t>
       </w:r>
     </w:p>
     <w:p>
@@ -569,6 +587,7 @@
         </w:rPr>
         <w:t>Signature</w:t>
       </w:r>
+      <w:proofErr w:type="gramStart"/>
       <w:r>
         <w:rPr>
           <w:rFonts w:cstheme="majorBidi"/>
@@ -584,6 +603,14 @@
           <w:bCs/>
         </w:rPr>
         <w:tab/>
+      </w:r>
+      <w:proofErr w:type="gramEnd"/>
+      <w:r>
+        <w:rPr>
+          <w:rFonts w:cstheme="majorBidi"/>
+          <w:b/>
+          <w:bCs/>
+        </w:rPr>
         <w:t>_______________________</w:t>
       </w:r>
     </w:p>
@@ -1572,7 +1599,21 @@
         <w:rPr>
           <w:rFonts w:asciiTheme="majorBidi" w:hAnsiTheme="majorBidi" w:cstheme="majorBidi"/>
         </w:rPr>
-        <w:t>Description (a short introduction, suggest no more than 1 page)</w:t>
+        <w:t xml:space="preserve">Description (a short introduction, </w:t>
+      </w:r>
+      <w:proofErr w:type="gramStart"/>
+      <w:r>
+        <w:rPr>
+          <w:rFonts w:asciiTheme="majorBidi" w:hAnsiTheme="majorBidi" w:cstheme="majorBidi"/>
+        </w:rPr>
+        <w:t>suggest</w:t>
+      </w:r>
+      <w:proofErr w:type="gramEnd"/>
+      <w:r>
+        <w:rPr>
+          <w:rFonts w:asciiTheme="majorBidi" w:hAnsiTheme="majorBidi" w:cstheme="majorBidi"/>
+        </w:rPr>
+        <w:t xml:space="preserve"> no more than 1 page)</w:t>
       </w:r>
       <w:bookmarkEnd w:id="1"/>
     </w:p>
@@ -1670,7 +1711,15 @@
         <w:spacing w:line="360" w:lineRule="auto"/>
       </w:pPr>
       <w:r>
-        <w:t>This one was made using Visio, but feel free to use whichever program to create it, or even can be done by hand and scanned.</w:t>
+        <w:t xml:space="preserve">This one was made using Visio, but feel free to use whichever program to create </w:t>
+      </w:r>
+      <w:proofErr w:type="gramStart"/>
+      <w:r>
+        <w:t>it, or</w:t>
+      </w:r>
+      <w:proofErr w:type="gramEnd"/>
+      <w:r>
+        <w:t xml:space="preserve"> even can be done by hand and scanned.</w:t>
       </w:r>
     </w:p>
     <w:p>
@@ -1707,7 +1756,7 @@
             <v:path o:extrusionok="f" gradientshapeok="t" o:connecttype="rect"/>
             <o:lock v:ext="edit" aspectratio="t"/>
           </v:shapetype>
-          <v:shape id="_x0000_i1030" type="#_x0000_t75" style="width:498.5pt;height:330pt">
+          <v:shape id="_x0000_i1025" type="#_x0000_t75" style="width:498.15pt;height:330.05pt">
             <v:imagedata r:id="rId18" o:title="Cumene_BFD"/>
           </v:shape>
         </w:pict>
@@ -2639,7 +2688,23 @@
       </w:r>
       <w:proofErr w:type="spellEnd"/>
       <w:r>
-        <w:t xml:space="preserve">, however these further side reactions will simply be considered to be taken into account with the </w:t>
+        <w:t xml:space="preserve">, however these further side reactions will simply </w:t>
+      </w:r>
+      <w:proofErr w:type="gramStart"/>
+      <w:r>
+        <w:t>be considered to be</w:t>
+      </w:r>
+      <w:proofErr w:type="gramEnd"/>
+      <w:r>
+        <w:t xml:space="preserve"> </w:t>
+      </w:r>
+      <w:proofErr w:type="gramStart"/>
+      <w:r>
+        <w:t>taken into account</w:t>
+      </w:r>
+      <w:proofErr w:type="gramEnd"/>
+      <w:r>
+        <w:t xml:space="preserve"> with the </w:t>
       </w:r>
       <w:r>
         <w:t>formation of DIPBs.</w:t>
@@ -2710,6 +2775,7 @@
         </w:rPr>
         <w:t>H</w:t>
       </w:r>
+      <w:proofErr w:type="gramStart"/>
       <w:r>
         <w:rPr>
           <w:sz w:val="16"/>
@@ -2734,6 +2800,7 @@
         </w:rPr>
         <w:t xml:space="preserve"> →</w:t>
       </w:r>
+      <w:proofErr w:type="gramEnd"/>
       <w:r>
         <w:rPr>
           <w:rFonts w:ascii="Wingdings-Regular" w:hAnsi="Wingdings-Regular" w:cs="Wingdings-Regular"/>
@@ -2763,6 +2830,7 @@
         </w:rPr>
         <w:t>H</w:t>
       </w:r>
+      <w:proofErr w:type="gramStart"/>
       <w:r>
         <w:rPr>
           <w:sz w:val="16"/>
@@ -2789,7 +2857,14 @@
         <w:rPr>
           <w:lang w:val="en-CA"/>
         </w:rPr>
-        <w:t>(1)</w:t>
+        <w:t>(</w:t>
+      </w:r>
+      <w:proofErr w:type="gramEnd"/>
+      <w:r>
+        <w:rPr>
+          <w:lang w:val="en-CA"/>
+        </w:rPr>
+        <w:t>1)</w:t>
       </w:r>
     </w:p>
     <w:p>
@@ -2959,7 +3034,15 @@
         <w:t>.</w:t>
       </w:r>
       <w:r>
-        <w:t xml:space="preserve"> The propane is a common contaminant in propylene, but is generally not reactive. For this simulation we will assume a 95% propylene purity with the remainder being propane, this purity has been used in economic studies of the cumene process [6].</w:t>
+        <w:t xml:space="preserve"> The propane is a common contaminant in </w:t>
+      </w:r>
+      <w:proofErr w:type="gramStart"/>
+      <w:r>
+        <w:t>propylene, but</w:t>
+      </w:r>
+      <w:proofErr w:type="gramEnd"/>
+      <w:r>
+        <w:t xml:space="preserve"> is generally not reactive. For this simulation we will assume a 95% propylene purity with the remainder being propane, this purity has been used in economic studies of the cumene process [6].</w:t>
       </w:r>
       <w:r>
         <w:t xml:space="preserve"> This mixture is typically preheated to temperatures ranging from 180 </w:t>
@@ -3012,7 +3095,23 @@
         <w:t xml:space="preserve"> [7].</w:t>
       </w:r>
       <w:r>
-        <w:t xml:space="preserve"> Benzene is typically in large excess in these reactions in order to help moderate the exothermic reaction. Early technologies fed in benzene to propylene at ratio of 8:1, but processes have improved to now feed 5:1 with interbed injection. The greater the benzene feed, the more costly the separation of benzene for recycle, so there is a tradeoff between controlling the reaction and getting good conversion and the cost of separation. For this simulation we will aim to produce 1% of the total phenol used in the world, so 7</w:t>
+        <w:t xml:space="preserve"> Benzene is typically in large excess in these reactions </w:t>
+      </w:r>
+      <w:proofErr w:type="gramStart"/>
+      <w:r>
+        <w:t>in order to</w:t>
+      </w:r>
+      <w:proofErr w:type="gramEnd"/>
+      <w:r>
+        <w:t xml:space="preserve"> help moderate the exothermic reaction. Early technologies fed in benzene to propylene at ratio of 8:1, but processes have improved to now feed 5:1 with interbed injection. The greater the benzene feed, the more costly the separation of benzene for </w:t>
+      </w:r>
+      <w:proofErr w:type="gramStart"/>
+      <w:r>
+        <w:t>recycle</w:t>
+      </w:r>
+      <w:proofErr w:type="gramEnd"/>
+      <w:r>
+        <w:t>, so there is a tradeoff between controlling the reaction and getting good conversion and the cost of separation. For this simulation we will aim to produce 1% of the total phenol used in the world, so 7</w:t>
       </w:r>
       <w:r>
         <w:t>0</w:t>
@@ -3046,10 +3145,26 @@
         <w:t xml:space="preserve">-moles/yr. </w:t>
       </w:r>
       <w:r>
-        <w:t>To start in our simulation, we will a</w:t>
-      </w:r>
-      <w:r>
-        <w:t xml:space="preserve">ssuming an overall process efficiency of 80% </w:t>
+        <w:t xml:space="preserve">To start </w:t>
+      </w:r>
+      <w:proofErr w:type="gramStart"/>
+      <w:r>
+        <w:t>in</w:t>
+      </w:r>
+      <w:proofErr w:type="gramEnd"/>
+      <w:r>
+        <w:t xml:space="preserve"> our simulation, we will </w:t>
+      </w:r>
+      <w:proofErr w:type="gramStart"/>
+      <w:r>
+        <w:t>a</w:t>
+      </w:r>
+      <w:r>
+        <w:t>ssuming</w:t>
+      </w:r>
+      <w:proofErr w:type="gramEnd"/>
+      <w:r>
+        <w:t xml:space="preserve"> an overall process efficiency of 80% </w:t>
       </w:r>
       <w:r>
         <w:t>and that the plant runs for 350 days per year. This means we need to feed 2</w:t>
@@ -3139,7 +3254,15 @@
         <w:t>.</w:t>
       </w:r>
       <w:r>
-        <w:t xml:space="preserve"> As is common with Aspen, the catalyst is not accounted for in the components and is taken into account in the rate law.</w:t>
+        <w:t xml:space="preserve"> As is common with Aspen, the catalyst is not accounted for in the components and is </w:t>
+      </w:r>
+      <w:proofErr w:type="gramStart"/>
+      <w:r>
+        <w:t>taken into account</w:t>
+      </w:r>
+      <w:proofErr w:type="gramEnd"/>
+      <w:r>
+        <w:t xml:space="preserve"> in the rate law.</w:t>
       </w:r>
     </w:p>
     <w:p>
@@ -3600,9 +3723,17 @@
         <w:rPr>
           <w:rFonts w:cstheme="majorBidi"/>
         </w:rPr>
-        <w:t>In the rate laws above the concentrations are in mol/L, and the overall rate in mol/(</w:t>
+        <w:t>In the rate laws above the concentrations are in mol/L, and the overall rate in mol</w:t>
+      </w:r>
+      <w:proofErr w:type="gramStart"/>
+      <w:r>
+        <w:rPr>
+          <w:rFonts w:cstheme="majorBidi"/>
+        </w:rPr>
+        <w:t>/(</w:t>
       </w:r>
       <w:proofErr w:type="spellStart"/>
+      <w:proofErr w:type="gramEnd"/>
       <w:r>
         <w:rPr>
           <w:rFonts w:cstheme="majorBidi"/>
@@ -3652,7 +3783,15 @@
         <w:t>optimize the process.</w:t>
       </w:r>
       <w:r>
-        <w:t xml:space="preserve"> Initially before setting up the kinetic reactor, an equilibrium reactor (REQUIL) was setup to see equilibrium conversion. This converted </w:t>
+        <w:t xml:space="preserve"> Initially before setting up the kinetic reactor, an equilibrium reactor (REQUIL) was </w:t>
+      </w:r>
+      <w:proofErr w:type="gramStart"/>
+      <w:r>
+        <w:t>setup</w:t>
+      </w:r>
+      <w:proofErr w:type="gramEnd"/>
+      <w:r>
+        <w:t xml:space="preserve"> to see equilibrium conversion. This converted </w:t>
       </w:r>
       <w:r>
         <w:t xml:space="preserve">87% of the propylene to cumene, with a small amount left </w:t>
@@ -3764,10 +3903,26 @@
         <w:t>/h of a feed propylene stream, and we will keep this same number of tubes for this initial simulation.</w:t>
       </w:r>
       <w:r>
-        <w:t xml:space="preserve"> All reactants and reactions are assumed to be in the vapour phase.</w:t>
-      </w:r>
-      <w:r>
-        <w:t xml:space="preserve"> With the above specifications, conversion of propylene to cumene is 98.4 %. This may be high, but is deemed acceptable for the start of simulation as this will likely change when adding more realistic heat transfer and recycle streams. This conversion is higher than equilibrium conversion, but this may be due to the side reaction being less favored kinetically. Concentration profiles over the reactor are shown in figure 2 below.</w:t>
+        <w:t xml:space="preserve"> All </w:t>
+      </w:r>
+      <w:proofErr w:type="gramStart"/>
+      <w:r>
+        <w:t>reactants</w:t>
+      </w:r>
+      <w:proofErr w:type="gramEnd"/>
+      <w:r>
+        <w:t xml:space="preserve"> and reactions are assumed to be in the vapour phase.</w:t>
+      </w:r>
+      <w:r>
+        <w:t xml:space="preserve"> With the above specifications, conversion of propylene to cumene is 98.4 %. This may be </w:t>
+      </w:r>
+      <w:proofErr w:type="gramStart"/>
+      <w:r>
+        <w:t>high, but</w:t>
+      </w:r>
+      <w:proofErr w:type="gramEnd"/>
+      <w:r>
+        <w:t xml:space="preserve"> is deemed acceptable for the start of simulation as this will likely change when adding more realistic heat transfer and recycle streams. This conversion is higher than equilibrium conversion, but this may be due to the side reaction being less favored kinetically. Concentration profiles over the reactor are shown in figure 2 below.</w:t>
       </w:r>
     </w:p>
     <w:p>
@@ -3885,7 +4040,21 @@
         <w:rPr>
           <w:lang w:val="en-CA"/>
         </w:rPr>
-        <w:t xml:space="preserve">. Also for this reactor I had to go through 3 different sets of kinetic data to find some </w:t>
+        <w:t xml:space="preserve">. </w:t>
+      </w:r>
+      <w:proofErr w:type="gramStart"/>
+      <w:r>
+        <w:rPr>
+          <w:lang w:val="en-CA"/>
+        </w:rPr>
+        <w:t>Also</w:t>
+      </w:r>
+      <w:proofErr w:type="gramEnd"/>
+      <w:r>
+        <w:rPr>
+          <w:lang w:val="en-CA"/>
+        </w:rPr>
+        <w:t xml:space="preserve"> for this reactor I had to go through 3 different sets of kinetic data to find some </w:t>
       </w:r>
       <w:r>
         <w:rPr>
@@ -6921,6 +7090,7 @@
   <w:style w:type="character" w:default="1" w:styleId="DefaultParagraphFont">
     <w:name w:val="Default Paragraph Font"/>
     <w:uiPriority w:val="1"/>
+    <w:semiHidden/>
     <w:unhideWhenUsed/>
   </w:style>
   <w:style w:type="table" w:default="1" w:styleId="TableNormal">
@@ -7582,27 +7752,6 @@
 </file>
 
 <file path=customXml/item1.xml><?xml version="1.0" encoding="utf-8"?>
-<?mso-contentType ?>
-<FormTemplates xmlns="http://schemas.microsoft.com/sharepoint/v3/contenttype/forms">
-  <Display>DocumentLibraryForm</Display>
-  <Edit>DocumentLibraryForm</Edit>
-  <New>DocumentLibraryForm</New>
-</FormTemplates>
-</file>
-
-<file path=customXml/item2.xml><?xml version="1.0" encoding="utf-8"?>
-<b:Sources xmlns:b="http://schemas.openxmlformats.org/officeDocument/2006/bibliography" xmlns="http://schemas.openxmlformats.org/officeDocument/2006/bibliography" SelectedStyle="\APASixthEditionOfficeOnline.xsl" StyleName="APA" Version="6"/>
-</file>
-
-<file path=customXml/item3.xml><?xml version="1.0" encoding="utf-8"?>
-<p:properties xmlns:p="http://schemas.microsoft.com/office/2006/metadata/properties" xmlns:xsi="http://www.w3.org/2001/XMLSchema-instance" xmlns:pc="http://schemas.microsoft.com/office/infopath/2007/PartnerControls">
-  <documentManagement>
-    <_activity xmlns="9ec2d0b7-503f-4434-bd5e-691963e6366e" xsi:nil="true"/>
-  </documentManagement>
-</p:properties>
-</file>
-
-<file path=customXml/item4.xml><?xml version="1.0" encoding="utf-8"?>
 <ct:contentTypeSchema xmlns:ct="http://schemas.microsoft.com/office/2006/metadata/contentType" xmlns:ma="http://schemas.microsoft.com/office/2006/metadata/properties/metaAttributes" ct:_="" ma:_="" ma:contentTypeName="Document" ma:contentTypeID="0x010100C107646D0035FA4C8F1F95DBA74C7670" ma:contentTypeVersion="18" ma:contentTypeDescription="Create a new document." ma:contentTypeScope="" ma:versionID="cee5fd123a01e1fbef544806d63a7bbe">
   <xsd:schema xmlns:xsd="http://www.w3.org/2001/XMLSchema" xmlns:xs="http://www.w3.org/2001/XMLSchema" xmlns:p="http://schemas.microsoft.com/office/2006/metadata/properties" xmlns:ns3="a169fe49-86d9-4b9f-a163-9271c3e82536" xmlns:ns4="9ec2d0b7-503f-4434-bd5e-691963e6366e" targetNamespace="http://schemas.microsoft.com/office/2006/metadata/properties" ma:root="true" ma:fieldsID="dda71d5f438c7df1ac194e497a63c795" ns3:_="" ns4:_="">
     <xsd:import namespace="a169fe49-86d9-4b9f-a163-9271c3e82536"/>
@@ -7855,33 +8004,28 @@
 </ct:contentTypeSchema>
 </file>
 
-<file path=customXml/itemProps1.xml><?xml version="1.0" encoding="utf-8"?>
-<ds:datastoreItem xmlns:ds="http://schemas.openxmlformats.org/officeDocument/2006/customXml" ds:itemID="{04D26766-6D42-46FD-AE9C-F80BA223CA67}">
-  <ds:schemaRefs>
-    <ds:schemaRef ds:uri="http://schemas.microsoft.com/sharepoint/v3/contenttype/forms"/>
-  </ds:schemaRefs>
-</ds:datastoreItem>
+<file path=customXml/item2.xml><?xml version="1.0" encoding="utf-8"?>
+<p:properties xmlns:p="http://schemas.microsoft.com/office/2006/metadata/properties" xmlns:xsi="http://www.w3.org/2001/XMLSchema-instance" xmlns:pc="http://schemas.microsoft.com/office/infopath/2007/PartnerControls">
+  <documentManagement>
+    <_activity xmlns="9ec2d0b7-503f-4434-bd5e-691963e6366e" xsi:nil="true"/>
+  </documentManagement>
+</p:properties>
 </file>
 
-<file path=customXml/itemProps2.xml><?xml version="1.0" encoding="utf-8"?>
-<ds:datastoreItem xmlns:ds="http://schemas.openxmlformats.org/officeDocument/2006/customXml" ds:itemID="{88749F4F-A6E8-4DC0-9276-CAFEB15C1658}">
-  <ds:schemaRefs>
-    <ds:schemaRef ds:uri="http://schemas.openxmlformats.org/officeDocument/2006/bibliography"/>
-  </ds:schemaRefs>
-</ds:datastoreItem>
+<file path=customXml/item3.xml><?xml version="1.0" encoding="utf-8"?>
+<b:Sources xmlns:b="http://schemas.openxmlformats.org/officeDocument/2006/bibliography" xmlns="http://schemas.openxmlformats.org/officeDocument/2006/bibliography" SelectedStyle="\APASixthEditionOfficeOnline.xsl" StyleName="APA" Version="6"/>
 </file>
 
-<file path=customXml/itemProps3.xml><?xml version="1.0" encoding="utf-8"?>
-<ds:datastoreItem xmlns:ds="http://schemas.openxmlformats.org/officeDocument/2006/customXml" ds:itemID="{2A4AFB90-AA70-40CB-8FEE-062855DEC269}">
-  <ds:schemaRefs>
-    <ds:schemaRef ds:uri="http://schemas.microsoft.com/office/2006/metadata/properties"/>
-    <ds:schemaRef ds:uri="http://schemas.microsoft.com/office/infopath/2007/PartnerControls"/>
-    <ds:schemaRef ds:uri="9ec2d0b7-503f-4434-bd5e-691963e6366e"/>
-  </ds:schemaRefs>
-</ds:datastoreItem>
+<file path=customXml/item4.xml><?xml version="1.0" encoding="utf-8"?>
+<?mso-contentType ?>
+<FormTemplates xmlns="http://schemas.microsoft.com/sharepoint/v3/contenttype/forms">
+  <Display>DocumentLibraryForm</Display>
+  <Edit>DocumentLibraryForm</Edit>
+  <New>DocumentLibraryForm</New>
+</FormTemplates>
 </file>
 
-<file path=customXml/itemProps4.xml><?xml version="1.0" encoding="utf-8"?>
+<file path=customXml/itemProps1.xml><?xml version="1.0" encoding="utf-8"?>
 <ds:datastoreItem xmlns:ds="http://schemas.openxmlformats.org/officeDocument/2006/customXml" ds:itemID="{8D503597-69F4-42D1-91A8-F656D146B62B}">
   <ds:schemaRefs>
     <ds:schemaRef ds:uri="http://schemas.microsoft.com/office/2006/metadata/contentType"/>
@@ -7898,4 +8042,30 @@
     <ds:schemaRef ds:uri="http://schemas.microsoft.com/internal/obd"/>
   </ds:schemaRefs>
 </ds:datastoreItem>
+</file>
+
+<file path=customXml/itemProps2.xml><?xml version="1.0" encoding="utf-8"?>
+<ds:datastoreItem xmlns:ds="http://schemas.openxmlformats.org/officeDocument/2006/customXml" ds:itemID="{2A4AFB90-AA70-40CB-8FEE-062855DEC269}">
+  <ds:schemaRefs>
+    <ds:schemaRef ds:uri="http://schemas.microsoft.com/office/2006/metadata/properties"/>
+    <ds:schemaRef ds:uri="http://schemas.microsoft.com/office/infopath/2007/PartnerControls"/>
+    <ds:schemaRef ds:uri="9ec2d0b7-503f-4434-bd5e-691963e6366e"/>
+  </ds:schemaRefs>
+</ds:datastoreItem>
+</file>
+
+<file path=customXml/itemProps3.xml><?xml version="1.0" encoding="utf-8"?>
+<ds:datastoreItem xmlns:ds="http://schemas.openxmlformats.org/officeDocument/2006/customXml" ds:itemID="{88749F4F-A6E8-4DC0-9276-CAFEB15C1658}">
+  <ds:schemaRefs>
+    <ds:schemaRef ds:uri="http://schemas.openxmlformats.org/officeDocument/2006/bibliography"/>
+  </ds:schemaRefs>
+</ds:datastoreItem>
+</file>
+
+<file path=customXml/itemProps4.xml><?xml version="1.0" encoding="utf-8"?>
+<ds:datastoreItem xmlns:ds="http://schemas.openxmlformats.org/officeDocument/2006/customXml" ds:itemID="{04D26766-6D42-46FD-AE9C-F80BA223CA67}">
+  <ds:schemaRefs>
+    <ds:schemaRef ds:uri="http://schemas.microsoft.com/sharepoint/v3/contenttype/forms"/>
+  </ds:schemaRefs>
+</ds:datastoreItem>
 </file>
</xml_diff>